<commit_message>
Expand AUTOSAR generation workflow and validation
</commit_message>
<xml_diff>
--- a/docs/test_template.docx
+++ b/docs/test_template.docx
@@ -1647,13 +1647,30 @@
             <w:tcW w:w="1480" w:type="dxa"/>
           </w:tcPr>
           <w:p>
-            <w:r>
-              <w:rPr>
-                <w:sz w:val="21"/>
-                <w:szCs w:val="21"/>
-              </w:rPr>
-              <w:t>0.3921568627</w:t>
-            </w:r>
+            <w:pPr>
+              <w:rPr>
+                <w:rFonts w:hint="eastAsia" w:eastAsiaTheme="minorEastAsia"/>
+                <w:lang w:val="en-US" w:eastAsia="zh-CN"/>
+              </w:rPr>
+            </w:pPr>
+            <w:r>
+              <w:rPr>
+                <w:sz w:val="21"/>
+                <w:szCs w:val="21"/>
+              </w:rPr>
+              <w:t>0.</w:t>
+            </w:r>
+            <w:r>
+              <w:rPr>
+                <w:rFonts w:hint="eastAsia"/>
+                <w:sz w:val="21"/>
+                <w:szCs w:val="21"/>
+                <w:lang w:val="en-US" w:eastAsia="zh-CN"/>
+              </w:rPr>
+              <w:t>1</w:t>
+            </w:r>
+            <w:bookmarkStart w:id="0" w:name="_GoBack"/>
+            <w:bookmarkEnd w:id="0"/>
           </w:p>
         </w:tc>
         <w:tc>
@@ -3627,12 +3644,6 @@
             <w:insideH w:val="single" w:color="auto" w:sz="4" w:space="0"/>
             <w:insideV w:val="single" w:color="auto" w:sz="4" w:space="0"/>
           </w:tblBorders>
-          <w:tblCellMar>
-            <w:top w:w="0" w:type="dxa"/>
-            <w:left w:w="108" w:type="dxa"/>
-            <w:bottom w:w="0" w:type="dxa"/>
-            <w:right w:w="108" w:type="dxa"/>
-          </w:tblCellMar>
         </w:tblPrEx>
         <w:tc>
           <w:tcPr>
@@ -7093,10 +7104,7 @@
         </w:numPr>
       </w:pPr>
     </w:p>
-    <w:p>
-      <w:bookmarkStart w:id="0" w:name="_GoBack"/>
-      <w:bookmarkEnd w:id="0"/>
-    </w:p>
+    <w:p/>
     <w:sectPr>
       <w:pgSz w:w="16838" w:h="11906" w:orient="landscape"/>
       <w:pgMar w:top="720" w:right="720" w:bottom="720" w:left="720" w:header="708" w:footer="708" w:gutter="0"/>
@@ -7182,7 +7190,7 @@
     <w:lsdException w:qFormat="1" w:unhideWhenUsed="0" w:uiPriority="0" w:semiHidden="0" w:name="Title"/>
     <w:lsdException w:unhideWhenUsed="0" w:uiPriority="0" w:semiHidden="0" w:name="Closing"/>
     <w:lsdException w:unhideWhenUsed="0" w:uiPriority="0" w:semiHidden="0" w:name="Signature"/>
-    <w:lsdException w:unhideWhenUsed="0" w:uiPriority="0" w:name="Default Paragraph Font"/>
+    <w:lsdException w:qFormat="1" w:unhideWhenUsed="0" w:uiPriority="0" w:name="Default Paragraph Font"/>
     <w:lsdException w:unhideWhenUsed="0" w:uiPriority="0" w:semiHidden="0" w:name="Body Text"/>
     <w:lsdException w:unhideWhenUsed="0" w:uiPriority="0" w:semiHidden="0" w:name="Body Text Indent"/>
     <w:lsdException w:unhideWhenUsed="0" w:uiPriority="0" w:semiHidden="0" w:name="List Continue"/>
@@ -7402,6 +7410,7 @@
   <w:style w:type="character" w:default="1" w:styleId="7">
     <w:name w:val="Default Paragraph Font"/>
     <w:semiHidden/>
+    <w:qFormat/>
     <w:uiPriority w:val="0"/>
   </w:style>
   <w:style w:type="table" w:default="1" w:styleId="5">

</xml_diff>